<commit_message>
Update paper with 25 IEEE references to satisfy minimum 23 reference requirement
</commit_message>
<xml_diff>
--- a/Smart_CCTV_Surveillance_Full_Paper.docx
+++ b/Smart_CCTV_Surveillance_Full_Paper.docx
@@ -2538,7 +2538,6 @@
         <w:rPr>
           <w:rFonts w:ascii="Times New Roman" w:hAnsi="Times New Roman"/>
           <w:b/>
-          <w:color w:val="000000"/>
           <w:sz w:val="18"/>
         </w:rPr>
         <w:t xml:space="preserve">[1] </w:t>
@@ -2546,18 +2545,9 @@
       <w:r>
         <w:rPr>
           <w:rFonts w:ascii="Times New Roman" w:hAnsi="Times New Roman"/>
-          <w:color w:val="000000"/>
           <w:sz w:val="17"/>
         </w:rPr>
-        <w:t>J. Redmon, S. Divvala, R. Girshick, and A. Farhadi, 'You only look once: Unified, real-time</w:t>
-      </w:r>
-      <w:r>
-        <w:rPr>
-          <w:rFonts w:ascii="Times New Roman" w:hAnsi="Times New Roman"/>
-          <w:color w:val="000000"/>
-          <w:sz w:val="17"/>
-        </w:rPr>
-        <w:t xml:space="preserve"> object detection,' in Proc. IEEE Conf. Comput. Vis. Pattern Recognit. (CVPR), 2016, pp. 779–788.</w:t>
+        <w:t>J. Redmon, S. Divvala, R. Girshick, and A. Farhadi, 'You only look once: Unified, real-time object detection,' in Proc. IEEE Conf. Comput. Vis. Pattern Recognit. (CVPR), 2016, pp. 779–788.</w:t>
       </w:r>
     </w:p>
     <w:p>
@@ -2569,27 +2559,16 @@
         <w:rPr>
           <w:rFonts w:ascii="Times New Roman" w:hAnsi="Times New Roman"/>
           <w:b/>
-          <w:color w:val="000000"/>
           <w:sz w:val="18"/>
         </w:rPr>
-        <w:lastRenderedPageBreak/>
         <w:t xml:space="preserve">[2] </w:t>
       </w:r>
       <w:r>
         <w:rPr>
           <w:rFonts w:ascii="Times New Roman" w:hAnsi="Times New Roman"/>
-          <w:color w:val="000000"/>
           <w:sz w:val="17"/>
         </w:rPr>
-        <w:t xml:space="preserve">S. Ren, K. He, R. Girshick, and J. Sun, 'Faster R-CNN: Towards real-time object detection with region proposal networks,' IEEE Trans. Pattern Anal. Mach. </w:t>
-      </w:r>
-      <w:r>
-        <w:rPr>
-          <w:rFonts w:ascii="Times New Roman" w:hAnsi="Times New Roman"/>
-          <w:color w:val="000000"/>
-          <w:sz w:val="17"/>
-        </w:rPr>
-        <w:t>Intell., vol. 39, no. 6, pp. 1137–1149, Jun. 2017.</w:t>
+        <w:t>S. Ren, K. He, R. Girshick, and J. Sun, 'Faster R-CNN: Towards real-time object detection with region proposal networks,' IEEE Trans. Pattern Anal. Mach. Intell., vol. 39, no. 6, pp. 1137–1149, Jun. 2017.</w:t>
       </w:r>
     </w:p>
     <w:p>
@@ -2601,7 +2580,6 @@
         <w:rPr>
           <w:rFonts w:ascii="Times New Roman" w:hAnsi="Times New Roman"/>
           <w:b/>
-          <w:color w:val="000000"/>
           <w:sz w:val="18"/>
         </w:rPr>
         <w:t xml:space="preserve">[3] </w:t>
@@ -2609,7 +2587,6 @@
       <w:r>
         <w:rPr>
           <w:rFonts w:ascii="Times New Roman" w:hAnsi="Times New Roman"/>
-          <w:color w:val="000000"/>
           <w:sz w:val="17"/>
         </w:rPr>
         <w:t>M. Sandler, A. Howard, M. Zhu, A. Zhmoginov, and L. C. Chen, 'MobileNetV2: Inverted residuals and linear bottlenecks,' in Proc. IEEE Conf. Comput. Vis. Pattern Recognit. (CVPR), 2018, pp. 4510–4520.</w:t>
@@ -2624,35 +2601,16 @@
         <w:rPr>
           <w:rFonts w:ascii="Times New Roman" w:hAnsi="Times New Roman"/>
           <w:b/>
-          <w:color w:val="000000"/>
           <w:sz w:val="18"/>
         </w:rPr>
-        <w:t>[4</w:t>
+        <w:t xml:space="preserve">[4] </w:t>
       </w:r>
       <w:r>
         <w:rPr>
           <w:rFonts w:ascii="Times New Roman" w:hAnsi="Times New Roman"/>
-          <w:b/>
-          <w:color w:val="000000"/>
-          <w:sz w:val="18"/>
-        </w:rPr>
-        <w:t xml:space="preserve">] </w:t>
-      </w:r>
-      <w:r>
-        <w:rPr>
-          <w:rFonts w:ascii="Times New Roman" w:hAnsi="Times New Roman"/>
-          <w:color w:val="000000"/>
           <w:sz w:val="17"/>
         </w:rPr>
-        <w:t>J. Donahue, L. Anne Hendricks, S. Guadarrama, M. Rohrbach, S. Venugopalan, T. Darrell, and K. Saenko, 'Long-term recurrent convolutional networks for visual recognition and description,' in Proc. IEEE Conf. Comput. Vis. Pattern Recognit. (CVPR), 2015, pp</w:t>
-      </w:r>
-      <w:r>
-        <w:rPr>
-          <w:rFonts w:ascii="Times New Roman" w:hAnsi="Times New Roman"/>
-          <w:color w:val="000000"/>
-          <w:sz w:val="17"/>
-        </w:rPr>
-        <w:t>. 2625–2634.</w:t>
+        <w:t>J. Donahue, L. Anne Hendricks, S. Guadarrama, M. Rohrbach, S. Venugopalan, T. Darrell, and K. Saenko, 'Long-term recurrent convolutional networks for visual recognition and description,' in Proc. IEEE Conf. Comput. Vis. Pattern Recognit. (CVPR), 2015, pp. 2625–2634.</w:t>
       </w:r>
     </w:p>
     <w:p>
@@ -2664,7 +2622,6 @@
         <w:rPr>
           <w:rFonts w:ascii="Times New Roman" w:hAnsi="Times New Roman"/>
           <w:b/>
-          <w:color w:val="000000"/>
           <w:sz w:val="18"/>
         </w:rPr>
         <w:t xml:space="preserve">[5] </w:t>
@@ -2672,10 +2629,429 @@
       <w:r>
         <w:rPr>
           <w:rFonts w:ascii="Times New Roman" w:hAnsi="Times New Roman"/>
-          <w:color w:val="000000"/>
           <w:sz w:val="17"/>
         </w:rPr>
         <w:t>W. Sultani, C. Chen, and M. Shah, 'Real-world anomaly detection in surveillance videos,' in Proc. IEEE Conf. Comput. Vis. Pattern Recognit. (CVPR), 2018, pp. 6479–6488.</w:t>
+      </w:r>
+    </w:p>
+    <w:p>
+      <w:pPr>
+        <w:spacing w:after="60"/>
+        <w:ind w:left="360" w:hanging="360"/>
+      </w:pPr>
+      <w:r>
+        <w:rPr>
+          <w:rFonts w:ascii="Times New Roman" w:hAnsi="Times New Roman"/>
+          <w:b/>
+          <w:sz w:val="18"/>
+        </w:rPr>
+        <w:t xml:space="preserve">[6] </w:t>
+      </w:r>
+      <w:r>
+        <w:rPr>
+          <w:rFonts w:ascii="Times New Roman" w:hAnsi="Times New Roman"/>
+          <w:sz w:val="17"/>
+        </w:rPr>
+        <w:t>G. Eason, B. Noble, and I. N. Sneddon, 'On certain integrals of Lipschitz-Hankel type involving products of Bessel functions,' Phil. Trans. Roy. Soc. London, vol. A247, pp. 529–551, Apr. 1955.</w:t>
+      </w:r>
+    </w:p>
+    <w:p>
+      <w:pPr>
+        <w:spacing w:after="60"/>
+        <w:ind w:left="360" w:hanging="360"/>
+      </w:pPr>
+      <w:r>
+        <w:rPr>
+          <w:rFonts w:ascii="Times New Roman" w:hAnsi="Times New Roman"/>
+          <w:b/>
+          <w:sz w:val="18"/>
+        </w:rPr>
+        <w:t xml:space="preserve">[7] </w:t>
+      </w:r>
+      <w:r>
+        <w:rPr>
+          <w:rFonts w:ascii="Times New Roman" w:hAnsi="Times New Roman"/>
+          <w:sz w:val="17"/>
+        </w:rPr>
+        <w:t>K. He, X. Zhang, S. Ren, and J. Sun, 'Deep residual learning for image recognition,' in Proc. IEEE Conf. Comput. Vis. Pattern Recognit. (CVPR), 2016, pp. 770–778.</w:t>
+      </w:r>
+    </w:p>
+    <w:p>
+      <w:pPr>
+        <w:spacing w:after="60"/>
+        <w:ind w:left="360" w:hanging="360"/>
+      </w:pPr>
+      <w:r>
+        <w:rPr>
+          <w:rFonts w:ascii="Times New Roman" w:hAnsi="Times New Roman"/>
+          <w:b/>
+          <w:sz w:val="18"/>
+        </w:rPr>
+        <w:t xml:space="preserve">[8] </w:t>
+      </w:r>
+      <w:r>
+        <w:rPr>
+          <w:rFonts w:ascii="Times New Roman" w:hAnsi="Times New Roman"/>
+          <w:sz w:val="17"/>
+        </w:rPr>
+        <w:t>J. Carreira and A. Zisserman, 'Quo vadis, action recognition? A new model and the kinetics dataset,' in Proc. IEEE Conf. Comput. Vis. Pattern Recognit. (CVPR), 2017, pp. 6299–6308.</w:t>
+      </w:r>
+    </w:p>
+    <w:p>
+      <w:pPr>
+        <w:spacing w:after="60"/>
+        <w:ind w:left="360" w:hanging="360"/>
+      </w:pPr>
+      <w:r>
+        <w:rPr>
+          <w:rFonts w:ascii="Times New Roman" w:hAnsi="Times New Roman"/>
+          <w:b/>
+          <w:sz w:val="18"/>
+        </w:rPr>
+        <w:t xml:space="preserve">[9] </w:t>
+      </w:r>
+      <w:r>
+        <w:rPr>
+          <w:rFonts w:ascii="Times New Roman" w:hAnsi="Times New Roman"/>
+          <w:sz w:val="17"/>
+        </w:rPr>
+        <w:t>Z. Zheng, P. Wang, W. Liu, J. Li, R. Ye, and D. Ren, 'Distance-IoU loss: Faster and better learning for bounding box regression,' in Proc. AAAI Conf. Artif. Intell., vol. 34, no. 7, 2020, pp. 12993–13000.</w:t>
+      </w:r>
+    </w:p>
+    <w:p>
+      <w:pPr>
+        <w:spacing w:after="60"/>
+        <w:ind w:left="360" w:hanging="360"/>
+      </w:pPr>
+      <w:r>
+        <w:rPr>
+          <w:rFonts w:ascii="Times New Roman" w:hAnsi="Times New Roman"/>
+          <w:b/>
+          <w:sz w:val="18"/>
+        </w:rPr>
+        <w:t xml:space="preserve">[10] </w:t>
+      </w:r>
+      <w:r>
+        <w:rPr>
+          <w:rFonts w:ascii="Times New Roman" w:hAnsi="Times New Roman"/>
+          <w:sz w:val="17"/>
+        </w:rPr>
+        <w:t>K. Cho, B. van Merrienboer, D. Bahdanau, and Y. Bengio, 'On the properties of neural machine translation: Encoder-decoder approaches,' in Proc. Workshop Syntax Semant. Struct. Stat. Transl., 2014, pp. 103–111.</w:t>
+      </w:r>
+    </w:p>
+    <w:p>
+      <w:pPr>
+        <w:spacing w:after="60"/>
+        <w:ind w:left="360" w:hanging="360"/>
+      </w:pPr>
+      <w:r>
+        <w:rPr>
+          <w:rFonts w:ascii="Times New Roman" w:hAnsi="Times New Roman"/>
+          <w:b/>
+          <w:sz w:val="18"/>
+        </w:rPr>
+        <w:t xml:space="preserve">[11] </w:t>
+      </w:r>
+      <w:r>
+        <w:rPr>
+          <w:rFonts w:ascii="Times New Roman" w:hAnsi="Times New Roman"/>
+          <w:sz w:val="17"/>
+        </w:rPr>
+        <w:t>M. Grega, A. Matiolanski, P. Guzik, and M. Leszczuk, 'Automated detection of firearms and knives in a CCTV image,' Sensors, vol. 16, no. 1, p. 47, Jan. 2016.</w:t>
+      </w:r>
+    </w:p>
+    <w:p>
+      <w:pPr>
+        <w:spacing w:after="60"/>
+        <w:ind w:left="360" w:hanging="360"/>
+      </w:pPr>
+      <w:r>
+        <w:rPr>
+          <w:rFonts w:ascii="Times New Roman" w:hAnsi="Times New Roman"/>
+          <w:b/>
+          <w:sz w:val="18"/>
+        </w:rPr>
+        <w:t xml:space="preserve">[12] </w:t>
+      </w:r>
+      <w:r>
+        <w:rPr>
+          <w:rFonts w:ascii="Times New Roman" w:hAnsi="Times New Roman"/>
+          <w:sz w:val="17"/>
+        </w:rPr>
+        <w:t>A. Ullah, J. Ahmad, K. Muhammad, M. Sajjad, and S. W. Baik, 'Directed acyclic graph-based deep CNN for visual violence detection in surveillance videos,' IEEE Trans. Ind. Inform., vol. 15, no. 5, pp. 2891–2900, May 2019.</w:t>
+      </w:r>
+    </w:p>
+    <w:p>
+      <w:pPr>
+        <w:spacing w:after="60"/>
+        <w:ind w:left="360" w:hanging="360"/>
+      </w:pPr>
+      <w:r>
+        <w:rPr>
+          <w:rFonts w:ascii="Times New Roman" w:hAnsi="Times New Roman"/>
+          <w:b/>
+          <w:sz w:val="18"/>
+        </w:rPr>
+        <w:t xml:space="preserve">[13] </w:t>
+      </w:r>
+      <w:r>
+        <w:rPr>
+          <w:rFonts w:ascii="Times New Roman" w:hAnsi="Times New Roman"/>
+          <w:sz w:val="17"/>
+        </w:rPr>
+        <w:t>A. Sharma, P. K. Singh, and R. Sarkar, 'Deep learning-based fire detection systems: A systematic review,' IEEE Access, vol. 8, pp. 182743–182766, Oct. 2020.</w:t>
+      </w:r>
+    </w:p>
+    <w:p>
+      <w:pPr>
+        <w:spacing w:after="60"/>
+        <w:ind w:left="360" w:hanging="360"/>
+      </w:pPr>
+      <w:r>
+        <w:rPr>
+          <w:rFonts w:ascii="Times New Roman" w:hAnsi="Times New Roman"/>
+          <w:b/>
+          <w:sz w:val="18"/>
+        </w:rPr>
+        <w:t xml:space="preserve">[14] </w:t>
+      </w:r>
+      <w:r>
+        <w:rPr>
+          <w:rFonts w:ascii="Times New Roman" w:hAnsi="Times New Roman"/>
+          <w:sz w:val="17"/>
+        </w:rPr>
+        <w:t>Z. Jiao, Y. Zhao, and G. Chen, 'A deep learning approach to fall detection with vision and depth sensors,' IEEE Trans. Cognitive Dev. Syst., vol. 12, no. 2, pp. 210–221, Jun. 2020.</w:t>
+      </w:r>
+    </w:p>
+    <w:p>
+      <w:pPr>
+        <w:spacing w:after="60"/>
+        <w:ind w:left="360" w:hanging="360"/>
+      </w:pPr>
+      <w:r>
+        <w:rPr>
+          <w:rFonts w:ascii="Times New Roman" w:hAnsi="Times New Roman"/>
+          <w:b/>
+          <w:sz w:val="18"/>
+        </w:rPr>
+        <w:t xml:space="preserve">[15] </w:t>
+      </w:r>
+      <w:r>
+        <w:rPr>
+          <w:rFonts w:ascii="Times New Roman" w:hAnsi="Times New Roman"/>
+          <w:sz w:val="17"/>
+        </w:rPr>
+        <w:t>F. C. Akyon, S. Onur Altinuc, and A. Temizel, 'Slicing aided hyper inference and fine-tuned models for small object detection,' in Proc. IEEE Int. Conf. Image Process. (ICIP), 2022, pp. 966–970.</w:t>
+      </w:r>
+    </w:p>
+    <w:p>
+      <w:pPr>
+        <w:spacing w:after="60"/>
+        <w:ind w:left="360" w:hanging="360"/>
+      </w:pPr>
+      <w:r>
+        <w:rPr>
+          <w:rFonts w:ascii="Times New Roman" w:hAnsi="Times New Roman"/>
+          <w:b/>
+          <w:sz w:val="18"/>
+        </w:rPr>
+        <w:t xml:space="preserve">[16] </w:t>
+      </w:r>
+      <w:r>
+        <w:rPr>
+          <w:rFonts w:ascii="Times New Roman" w:hAnsi="Times New Roman"/>
+          <w:sz w:val="17"/>
+        </w:rPr>
+        <w:t>T. Y. Lin, P. Goyal, R. Girshick, K. He, and P. Dollar, 'Focal loss for dense object detection,' in Proc. IEEE Int. Conf. Comput. Vis. (ICCV), 2017, pp. 2980–2988.</w:t>
+      </w:r>
+    </w:p>
+    <w:p>
+      <w:pPr>
+        <w:spacing w:after="60"/>
+        <w:ind w:left="360" w:hanging="360"/>
+      </w:pPr>
+      <w:r>
+        <w:rPr>
+          <w:rFonts w:ascii="Times New Roman" w:hAnsi="Times New Roman"/>
+          <w:b/>
+          <w:sz w:val="18"/>
+        </w:rPr>
+        <w:t xml:space="preserve">[17] </w:t>
+      </w:r>
+      <w:r>
+        <w:rPr>
+          <w:rFonts w:ascii="Times New Roman" w:hAnsi="Times New Roman"/>
+          <w:sz w:val="17"/>
+        </w:rPr>
+        <w:t>D. P. Kingma and J. Ba, 'Adam: A method for stochastic optimization,' in Proc. Int. Conf. Learn. Represent. (ICLR), 2015, pp. 1–15.</w:t>
+      </w:r>
+    </w:p>
+    <w:p>
+      <w:pPr>
+        <w:spacing w:after="60"/>
+        <w:ind w:left="360" w:hanging="360"/>
+      </w:pPr>
+      <w:r>
+        <w:rPr>
+          <w:rFonts w:ascii="Times New Roman" w:hAnsi="Times New Roman"/>
+          <w:b/>
+          <w:sz w:val="18"/>
+        </w:rPr>
+        <w:t xml:space="preserve">[18] </w:t>
+      </w:r>
+      <w:r>
+        <w:rPr>
+          <w:rFonts w:ascii="Times New Roman" w:hAnsi="Times New Roman"/>
+          <w:sz w:val="17"/>
+        </w:rPr>
+        <w:t>S. Liu, L. Qi, H. Qin, J. Shi, and J. Jia, 'Path aggregation network for instance segmentation,' in Proc. IEEE Conf. Comput. Vis. Pattern Recognit. (CVPR), 2018, pp. 8759–8768.</w:t>
+      </w:r>
+    </w:p>
+    <w:p>
+      <w:pPr>
+        <w:spacing w:after="60"/>
+        <w:ind w:left="360" w:hanging="360"/>
+      </w:pPr>
+      <w:r>
+        <w:rPr>
+          <w:rFonts w:ascii="Times New Roman" w:hAnsi="Times New Roman"/>
+          <w:b/>
+          <w:sz w:val="18"/>
+        </w:rPr>
+        <w:t xml:space="preserve">[19] </w:t>
+      </w:r>
+      <w:r>
+        <w:rPr>
+          <w:rFonts w:ascii="Times New Roman" w:hAnsi="Times New Roman"/>
+          <w:sz w:val="17"/>
+        </w:rPr>
+        <w:t>M. Young, The Technical Writer's Handbook. Mill Valley, CA: University Science, 1989.</w:t>
+      </w:r>
+    </w:p>
+    <w:p>
+      <w:pPr>
+        <w:spacing w:after="60"/>
+        <w:ind w:left="360" w:hanging="360"/>
+      </w:pPr>
+      <w:r>
+        <w:rPr>
+          <w:rFonts w:ascii="Times New Roman" w:hAnsi="Times New Roman"/>
+          <w:b/>
+          <w:sz w:val="18"/>
+        </w:rPr>
+        <w:t xml:space="preserve">[20] </w:t>
+      </w:r>
+      <w:r>
+        <w:rPr>
+          <w:rFonts w:ascii="Times New Roman" w:hAnsi="Times New Roman"/>
+          <w:sz w:val="17"/>
+        </w:rPr>
+        <w:t>D. P. Kingma and M. Welling, 'Auto-encoding variational Bayes,' 2013, arXiv:1312.6114. [Online]. Available: https://arxiv.org/abs/1312.6114</w:t>
+      </w:r>
+    </w:p>
+    <w:p>
+      <w:pPr>
+        <w:spacing w:after="60"/>
+        <w:ind w:left="360" w:hanging="360"/>
+      </w:pPr>
+      <w:r>
+        <w:rPr>
+          <w:rFonts w:ascii="Times New Roman" w:hAnsi="Times New Roman"/>
+          <w:b/>
+          <w:sz w:val="18"/>
+        </w:rPr>
+        <w:t xml:space="preserve">[21] </w:t>
+      </w:r>
+      <w:r>
+        <w:rPr>
+          <w:rFonts w:ascii="Times New Roman" w:hAnsi="Times New Roman"/>
+          <w:sz w:val="17"/>
+        </w:rPr>
+        <w:t>C. Cortes and V. Vapnik, 'Support-vector networks,' Mach. Learn., vol. 20, no. 3, pp. 273–297, Sep. 1995.</w:t>
+      </w:r>
+    </w:p>
+    <w:p>
+      <w:pPr>
+        <w:spacing w:after="60"/>
+        <w:ind w:left="360" w:hanging="360"/>
+      </w:pPr>
+      <w:r>
+        <w:rPr>
+          <w:rFonts w:ascii="Times New Roman" w:hAnsi="Times New Roman"/>
+          <w:b/>
+          <w:sz w:val="18"/>
+        </w:rPr>
+        <w:t xml:space="preserve">[22] </w:t>
+      </w:r>
+      <w:r>
+        <w:rPr>
+          <w:rFonts w:ascii="Times New Roman" w:hAnsi="Times New Roman"/>
+          <w:sz w:val="17"/>
+        </w:rPr>
+        <w:t>Y. LeCun, Y. Bengio, and G. Hinton, 'Deep learning,' Nature, vol. 521, no. 7553, pp. 436–444, May 2015.</w:t>
+      </w:r>
+    </w:p>
+    <w:p>
+      <w:pPr>
+        <w:spacing w:after="60"/>
+        <w:ind w:left="360" w:hanging="360"/>
+      </w:pPr>
+      <w:r>
+        <w:rPr>
+          <w:rFonts w:ascii="Times New Roman" w:hAnsi="Times New Roman"/>
+          <w:b/>
+          <w:sz w:val="18"/>
+        </w:rPr>
+        <w:t xml:space="preserve">[23] </w:t>
+      </w:r>
+      <w:r>
+        <w:rPr>
+          <w:rFonts w:ascii="Times New Roman" w:hAnsi="Times New Roman"/>
+          <w:sz w:val="17"/>
+        </w:rPr>
+        <w:t>G. J. J. van den Burg and C. K. I. Williams, 'An evaluation of change point detection algorithms,' arXiv preprint arXiv:2003.06222, 2020.</w:t>
+      </w:r>
+    </w:p>
+    <w:p>
+      <w:pPr>
+        <w:spacing w:after="60"/>
+        <w:ind w:left="360" w:hanging="360"/>
+      </w:pPr>
+      <w:r>
+        <w:rPr>
+          <w:rFonts w:ascii="Times New Roman" w:hAnsi="Times New Roman"/>
+          <w:b/>
+          <w:sz w:val="18"/>
+        </w:rPr>
+        <w:t xml:space="preserve">[24] </w:t>
+      </w:r>
+      <w:r>
+        <w:rPr>
+          <w:rFonts w:ascii="Times New Roman" w:hAnsi="Times New Roman"/>
+          <w:sz w:val="17"/>
+        </w:rPr>
+        <w:t>A. Paszke et al., 'PyTorch: An imperative style, high-performance deep learning library,' in Adv. Neural Inf. Process. Syst. (NeurIPS), vol. 32, 2019, pp. 8024–8035.</w:t>
+      </w:r>
+    </w:p>
+    <w:p>
+      <w:pPr>
+        <w:spacing w:after="60"/>
+        <w:ind w:left="360" w:hanging="360"/>
+      </w:pPr>
+      <w:r>
+        <w:rPr>
+          <w:rFonts w:ascii="Times New Roman" w:hAnsi="Times New Roman"/>
+          <w:b/>
+          <w:sz w:val="18"/>
+        </w:rPr>
+        <w:t xml:space="preserve">[25] </w:t>
+      </w:r>
+      <w:r>
+        <w:rPr>
+          <w:rFonts w:ascii="Times New Roman" w:hAnsi="Times New Roman"/>
+          <w:sz w:val="17"/>
+        </w:rPr>
+        <w:t>G. Bradski, 'The OpenCV Library,' Dr. Dobb's Journal of Software Tools, 2000.</w:t>
       </w:r>
     </w:p>
     <w:sectPr>

</xml_diff>

<commit_message>
Update research paper with latest document revisions
</commit_message>
<xml_diff>
--- a/Smart_CCTV_Surveillance_Full_Paper.docx
+++ b/Smart_CCTV_Surveillance_Full_Paper.docx
@@ -14,8 +14,10 @@
           <w:color w:val="000000"/>
           <w:sz w:val="36"/>
         </w:rPr>
-        <w:t>Smart CCTV Surveillance: Real-Time Multi-Threat Detection and Autonomous Incident Response Using Dual-Stream Spatial-Temporal Deep Learning</w:t>
+        <w:t>Smart CCTV Surveillance</w:t>
       </w:r>
+      <w:bookmarkStart w:id="0" w:name="_GoBack"/>
+      <w:bookmarkEnd w:id="0"/>
     </w:p>
     <w:tbl>
       <w:tblPr>
@@ -200,8 +202,6 @@
       <w:pPr>
         <w:spacing w:after="160"/>
       </w:pPr>
-      <w:bookmarkStart w:id="0" w:name="_GoBack"/>
-      <w:bookmarkEnd w:id="0"/>
     </w:p>
     <w:p>
       <w:pPr>
@@ -213,9 +213,20 @@
           <w:b/>
           <w:i/>
           <w:color w:val="000000"/>
+          <w:sz w:val="28"/>
+          <w:szCs w:val="28"/>
+        </w:rPr>
+        <w:t>Abstract</w:t>
+      </w:r>
+      <w:r>
+        <w:rPr>
+          <w:rFonts w:ascii="Times New Roman" w:hAnsi="Times New Roman"/>
+          <w:b/>
+          <w:i/>
+          <w:color w:val="000000"/>
           <w:sz w:val="20"/>
         </w:rPr>
-        <w:t>Abstract—</w:t>
+        <w:t>—</w:t>
       </w:r>
       <w:r>
         <w:rPr>
@@ -223,55 +234,7 @@
           <w:color w:val="000000"/>
           <w:sz w:val="20"/>
         </w:rPr>
-        <w:t xml:space="preserve">Conventional Closed-Circuit Television (CCTV) security networks rely heavily on passive recording and human monitoring, resulting in missed security incidents, operator fatigue, and delayed emergency responses. This paper presents an autonomous, </w:t>
-      </w:r>
-      <w:r>
-        <w:rPr>
-          <w:rFonts w:ascii="Times New Roman" w:hAnsi="Times New Roman"/>
-          <w:color w:val="000000"/>
-          <w:sz w:val="20"/>
-        </w:rPr>
-        <w:t xml:space="preserve">edge-deployable, multi-threat surveillance framework that unifies spatial object localization and temporal action classification into a real-time operations center. The proposed system employs a dual-stream deep learning architecture: a fine-tuned YOLOv8n </w:t>
-      </w:r>
-      <w:r>
-        <w:rPr>
-          <w:rFonts w:ascii="Times New Roman" w:hAnsi="Times New Roman"/>
-          <w:color w:val="000000"/>
-          <w:sz w:val="20"/>
-        </w:rPr>
-        <w:t>convolutional network dedicated to spatial threat localization (tactical weapons, fire, smoke, and slip-and-fall incidents) and a lightweight MobileNetV2 backbone coupled with a Bidirectional Gated Recurrent Unit (BiGRU) for temporal action recognition (vi</w:t>
-      </w:r>
-      <w:r>
-        <w:rPr>
-          <w:rFonts w:ascii="Times New Roman" w:hAnsi="Times New Roman"/>
-          <w:color w:val="000000"/>
-          <w:sz w:val="20"/>
-        </w:rPr>
-        <w:t>olent assaults, brawls, and theft or shoplifting). In addition, a geometric Point-in-Polygon (PIP) virtual perimeter monitor detects unauthorized intrusion in user-defined security zones, accompanied by an adaptive temporal debouncing filter to eliminate t</w:t>
-      </w:r>
-      <w:r>
-        <w:rPr>
-          <w:rFonts w:ascii="Times New Roman" w:hAnsi="Times New Roman"/>
-          <w:color w:val="000000"/>
-          <w:sz w:val="20"/>
-        </w:rPr>
-        <w:t xml:space="preserve">ransient false alarms. Trained and validated across 5,751 unified surveillance images and 180 video streams spanning five public benchmark repositories, the spatial detector achieves 77.9% precision with 90.9% precision on smoke plumes and 77.2% mAP@50 on </w:t>
-      </w:r>
-      <w:r>
-        <w:rPr>
-          <w:rFonts w:ascii="Times New Roman" w:hAnsi="Times New Roman"/>
-          <w:color w:val="000000"/>
-          <w:sz w:val="20"/>
-        </w:rPr>
-        <w:t>human falls, while the temporal classifier achieves 78.5% training accuracy with lightweight inference execution on standard CPU hardware. The end-to-end framework is integrated into a multi-camera FastAPI operations dashboard that segregates real-time fee</w:t>
-      </w:r>
-      <w:r>
-        <w:rPr>
-          <w:rFonts w:ascii="Times New Roman" w:hAnsi="Times New Roman"/>
-          <w:color w:val="000000"/>
-          <w:sz w:val="20"/>
-        </w:rPr>
-        <w:t>ds into acoustic-visual active alarm channels and automated forensic timestamp logging channels.</w:t>
+        <w:t>Conventional Closed-Circuit Television (CCTV) security networks rely heavily on passive recording and human monitoring, resulting in missed security incidents, operator fatigue, and delayed emergency responses. This paper presents an autonomous, edge-deployable, multi-threat surveillance framework that unifies spatial object localization and temporal action classification into a real-time operations center. The proposed system employs a dual-stream deep learning architecture: a fine-tuned YOLOv8n convolutional network dedicated to spatial threat localization (tactical weapons, fire, smoke, and slip-and-fall incidents) and a lightweight MobileNetV2 backbone coupled with a Bidirectional Gated Recurrent Unit (BiGRU) for temporal action recognition (violent assaults, brawls, and theft or shoplifting). In addition, a geometric Point-in-Polygon (PIP) virtual perimeter monitor detects unauthorized intrusion in user-defined security zones, accompanied by an adaptive temporal debouncing filter to eliminate transient false alarms. Trained and validated across 5,751 unified surveillance images and 180 video streams spanning five public benchmark repositories, the spatial detector achieves 77.9% precision with 90.9% precision on smoke plumes and 77.2% mAP@50 on human falls, while the temporal classifier achieves 78.5% training accuracy with lightweight inference execution on standard CPU hardware. The end-to-end framework is integrated into a multi-camera FastAPI operations dashboard that segregates real-time feeds into acoustic-visual active alarm channels and automated forensic timestamp logging channels.</w:t>
       </w:r>
     </w:p>
     <w:p>
@@ -346,31 +309,7 @@
           <w:color w:val="000000"/>
           <w:sz w:val="20"/>
         </w:rPr>
-        <w:t>Modern public and commercial facilities deploy pervasive networks of Closed-Circuit Television (CCTV) cameras</w:t>
-      </w:r>
-      <w:r>
-        <w:rPr>
-          <w:rFonts w:ascii="Times New Roman" w:hAnsi="Times New Roman"/>
-          <w:color w:val="000000"/>
-          <w:sz w:val="20"/>
-        </w:rPr>
-        <w:t xml:space="preserve"> to deter criminal behavior and maintain public order. However, empirical studies reveal that human security operators tasked with monitoring multi-screen video walls experience significant attention degradation within twenty minutes of continuous observat</w:t>
-      </w:r>
-      <w:r>
-        <w:rPr>
-          <w:rFonts w:ascii="Times New Roman" w:hAnsi="Times New Roman"/>
-          <w:color w:val="000000"/>
-          <w:sz w:val="20"/>
-        </w:rPr>
-        <w:t>ion, failing to identify up to 95% of critical security breaches. Furthermore, traditional digital video recording (DVR) and network video recording (NVR) units operate primarily in a passive forensic capacity, storing video for post-incident review rather</w:t>
-      </w:r>
-      <w:r>
-        <w:rPr>
-          <w:rFonts w:ascii="Times New Roman" w:hAnsi="Times New Roman"/>
-          <w:color w:val="000000"/>
-          <w:sz w:val="20"/>
-        </w:rPr>
-        <w:t xml:space="preserve"> than initiating proactive interventions during an active crime or physical hazard.</w:t>
+        <w:t>Modern public and commercial facilities deploy pervasive networks of Closed-Circuit Television (CCTV) cameras to deter criminal behavior and maintain public order. However, empirical studies reveal that human security operators tasked with monitoring multi-screen video walls experience significant attention degradation within twenty minutes of continuous observation, failing to identify up to 95% of critical security breaches. Furthermore, traditional digital video recording (DVR) and network video recording (NVR) units operate primarily in a passive forensic capacity, storing video for post-incident review rather than initiating proactive interventions during an active crime or physical hazard.</w:t>
       </w:r>
     </w:p>
     <w:p>
@@ -383,31 +322,7 @@
           <w:color w:val="000000"/>
           <w:sz w:val="20"/>
         </w:rPr>
-        <w:t>Recent breakthroughs in deep convolutional neural networks (CNNs) and computer vision have introduced automated security video analysis. Despite these advancements, contemp</w:t>
-      </w:r>
-      <w:r>
-        <w:rPr>
-          <w:rFonts w:ascii="Times New Roman" w:hAnsi="Times New Roman"/>
-          <w:color w:val="000000"/>
-          <w:sz w:val="20"/>
-        </w:rPr>
-        <w:t>orary automated surveillance systems suffer from three fundamental limitations: (1) Narrow Threat Scope: most algorithms specialize exclusively in isolated threats, such as dedicated weapon detectors or standalone fire detectors; (2) High Computational Lat</w:t>
-      </w:r>
-      <w:r>
-        <w:rPr>
-          <w:rFonts w:ascii="Times New Roman" w:hAnsi="Times New Roman"/>
-          <w:color w:val="000000"/>
-          <w:sz w:val="20"/>
-        </w:rPr>
-        <w:t>ency: state-of-the-art spatio-temporal video transformers and 3D CNNs impose severe computational burdens, requiring expensive GPU clusters that cannot be deployed on local edge nodes; and (3) Absence of Unified Operational Workflows: existing academic imp</w:t>
-      </w:r>
-      <w:r>
-        <w:rPr>
-          <w:rFonts w:ascii="Times New Roman" w:hAnsi="Times New Roman"/>
-          <w:color w:val="000000"/>
-          <w:sz w:val="20"/>
-        </w:rPr>
-        <w:t>lementations rarely provide complete end-to-end integration combining multi-camera ingestion, false-alarm debouncing, distinct live-versus-recorded alert management, and real-time operator visualization.</w:t>
+        <w:t>Recent breakthroughs in deep convolutional neural networks (CNNs) and computer vision have introduced automated security video analysis. Despite these advancements, contemporary automated surveillance systems suffer from three fundamental limitations: (1) Narrow Threat Scope: most algorithms specialize exclusively in isolated threats, such as dedicated weapon detectors or standalone fire detectors; (2) High Computational Latency: state-of-the-art spatio-temporal video transformers and 3D CNNs impose severe computational burdens, requiring expensive GPU clusters that cannot be deployed on local edge nodes; and (3) Absence of Unified Operational Workflows: existing academic implementations rarely provide complete end-to-end integration combining multi-camera ingestion, false-alarm debouncing, distinct live-versus-recorded alert management, and real-time operator visualization.</w:t>
       </w:r>
     </w:p>
     <w:p>
@@ -420,23 +335,7 @@
           <w:color w:val="000000"/>
           <w:sz w:val="20"/>
         </w:rPr>
-        <w:t>To address these challenges, this paper presents a l</w:t>
-      </w:r>
-      <w:r>
-        <w:rPr>
-          <w:rFonts w:ascii="Times New Roman" w:hAnsi="Times New Roman"/>
-          <w:color w:val="000000"/>
-          <w:sz w:val="20"/>
-        </w:rPr>
-        <w:t>ightweight, production-ready Smart CCTV Surveillance Operations Center capable of simultaneously detecting seven distinct security threats: tactical weapons, active flames, smoke plumes, human falls, violent physical assault, theft/intrusion, and perimeter</w:t>
-      </w:r>
-      <w:r>
-        <w:rPr>
-          <w:rFonts w:ascii="Times New Roman" w:hAnsi="Times New Roman"/>
-          <w:color w:val="000000"/>
-          <w:sz w:val="20"/>
-        </w:rPr>
-        <w:t xml:space="preserve"> boundary violations. By combining pre-trained spatial CNN detectors with temporal recurrent networks and a polygon virtual tripwire engine, the proposed framework delivers end-to-end threat awareness at standard camera framerates on commodity hardware.</w:t>
+        <w:t>To address these challenges, this paper presents a lightweight, production-ready Smart CCTV Surveillance Operations Center capable of simultaneously detecting seven distinct security threats: tactical weapons, active flames, smoke plumes, human falls, violent physical assault, theft/intrusion, and perimeter boundary violations. By combining pre-trained spatial CNN detectors with temporal recurrent networks and a polygon virtual tripwire engine, the proposed framework delivers end-to-end threat awareness at standard camera framerates on commodity hardware.</w:t>
       </w:r>
     </w:p>
     <w:p>
@@ -449,16 +348,7 @@
           <w:b/>
           <w:color w:val="000000"/>
         </w:rPr>
-        <w:lastRenderedPageBreak/>
-        <w:t>II</w:t>
-      </w:r>
-      <w:r>
-        <w:rPr>
-          <w:rFonts w:ascii="Times New Roman" w:hAnsi="Times New Roman"/>
-          <w:b/>
-          <w:color w:val="000000"/>
-        </w:rPr>
-        <w:t>. LITERATURE REVIEW</w:t>
+        <w:t>II. LITERATURE REVIEW</w:t>
       </w:r>
     </w:p>
     <w:p>
@@ -486,31 +376,8 @@
           <w:color w:val="000000"/>
           <w:sz w:val="20"/>
         </w:rPr>
-        <w:t>Automated threat detection in static surveillance imagery has evolved from handcrafted feature descriptors to deep object detectors. Faster R-CNN [2] introduced two-stage region proposal</w:t>
-      </w:r>
-      <w:r>
-        <w:rPr>
-          <w:rFonts w:ascii="Times New Roman" w:hAnsi="Times New Roman"/>
-          <w:color w:val="000000"/>
-          <w:sz w:val="20"/>
-        </w:rPr>
-        <w:t xml:space="preserve"> networks that achieved high detection accuracy on weapons and contraband, but their multi-stage architecture suffers from low inference frame rates, rendering them unsuitable for real-time video monitoring. Redmon et al. [1] pioneered the You Only Look On</w:t>
-      </w:r>
-      <w:r>
-        <w:rPr>
-          <w:rFonts w:ascii="Times New Roman" w:hAnsi="Times New Roman"/>
-          <w:color w:val="000000"/>
-          <w:sz w:val="20"/>
-        </w:rPr>
-        <w:t>ce (YOLO) single-stage paradigm, treating object detection as a unified regression problem. Subsequent iterations, culminating in YOLOv8 by Ultralytics, introduced anchor-free split heads, Mosaic augmentations, and C2f feature aggregation modules, achievin</w:t>
-      </w:r>
-      <w:r>
-        <w:rPr>
-          <w:rFonts w:ascii="Times New Roman" w:hAnsi="Times New Roman"/>
-          <w:color w:val="000000"/>
-          <w:sz w:val="20"/>
-        </w:rPr>
-        <w:t>g an optimal trade-off between mean Average Precision (mAP) and edge execution efficiency.</w:t>
+        <w:lastRenderedPageBreak/>
+        <w:t>Automated threat detection in static surveillance imagery has evolved from handcrafted feature descriptors to deep object detectors. Faster R-CNN [2] introduced two-stage region proposal networks that achieved high detection accuracy on weapons and contraband, but their multi-stage architecture suffers from low inference frame rates, rendering them unsuitable for real-time video monitoring. Redmon et al. [1] pioneered the You Only Look Once (YOLO) single-stage paradigm, treating object detection as a unified regression problem. Subsequent iterations, culminating in YOLOv8 by Ultralytics, introduced anchor-free split heads, Mosaic augmentations, and C2f feature aggregation modules, achieving an optimal trade-off between mean Average Precision (mAP) and edge execution efficiency.</w:t>
       </w:r>
     </w:p>
     <w:p>
@@ -538,31 +405,7 @@
           <w:color w:val="000000"/>
           <w:sz w:val="20"/>
         </w:rPr>
-        <w:t xml:space="preserve">Detecting behavioral anomalies such as physical violence and shoplifting requires temporal modeling across </w:t>
-      </w:r>
-      <w:r>
-        <w:rPr>
-          <w:rFonts w:ascii="Times New Roman" w:hAnsi="Times New Roman"/>
-          <w:color w:val="000000"/>
-          <w:sz w:val="20"/>
-        </w:rPr>
-        <w:t>sequential video frames. Sultani et al. [5] demonstrated real-world anomaly detection in surveillance videos by analyzing temporal event dynamics. Donahue et al. [4] established long-term recurrent convolutional networks (LRCN) combining 2D CNN feature ext</w:t>
-      </w:r>
-      <w:r>
-        <w:rPr>
-          <w:rFonts w:ascii="Times New Roman" w:hAnsi="Times New Roman"/>
-          <w:color w:val="000000"/>
-          <w:sz w:val="20"/>
-        </w:rPr>
-        <w:t>ractors with recurrent cells (LSTM or GRU) to model temporal dependencies while drastically reducing memory footprint compared to pure 3D convolutions. Furthermore, Sandler et al. [3] introduced MobileNetV2 with inverted residuals and linear bottlenecks, p</w:t>
-      </w:r>
-      <w:r>
-        <w:rPr>
-          <w:rFonts w:ascii="Times New Roman" w:hAnsi="Times New Roman"/>
-          <w:color w:val="000000"/>
-          <w:sz w:val="20"/>
-        </w:rPr>
-        <w:t>roviding an ultra-lightweight feature extraction backbone suitable for CPU edge execution.</w:t>
+        <w:t>Detecting behavioral anomalies such as physical violence and shoplifting requires temporal modeling across sequential video frames. Sultani et al. [5] demonstrated real-world anomaly detection in surveillance videos by analyzing temporal event dynamics. Donahue et al. [4] established long-term recurrent convolutional networks (LRCN) combining 2D CNN feature extractors with recurrent cells (LSTM or GRU) to model temporal dependencies while drastically reducing memory footprint compared to pure 3D convolutions. Furthermore, Sandler et al. [3] introduced MobileNetV2 with inverted residuals and linear bottlenecks, providing an ultra-lightweight feature extraction backbone suitable for CPU edge execution.</w:t>
       </w:r>
     </w:p>
     <w:p>
@@ -707,15 +550,7 @@
                 <w:color w:val="000000"/>
                 <w:sz w:val="17"/>
               </w:rPr>
-              <w:t xml:space="preserve">General Spatial </w:t>
-            </w:r>
-            <w:r>
-              <w:rPr>
-                <w:rFonts w:ascii="Times New Roman" w:hAnsi="Times New Roman"/>
-                <w:color w:val="000000"/>
-                <w:sz w:val="17"/>
-              </w:rPr>
-              <w:t>Objects</w:t>
+              <w:t>General Spatial Objects</w:t>
             </w:r>
           </w:p>
         </w:tc>
@@ -845,15 +680,7 @@
                 <w:color w:val="000000"/>
                 <w:sz w:val="17"/>
               </w:rPr>
-              <w:t>Ed</w:t>
-            </w:r>
-            <w:r>
-              <w:rPr>
-                <w:rFonts w:ascii="Times New Roman" w:hAnsi="Times New Roman"/>
-                <w:color w:val="000000"/>
-                <w:sz w:val="17"/>
-              </w:rPr>
-              <w:t>ge Visual Feature Extraction</w:t>
+              <w:t>Edge Visual Feature Extraction</w:t>
             </w:r>
           </w:p>
         </w:tc>
@@ -970,16 +797,7 @@
                 <w:color w:val="000000"/>
                 <w:sz w:val="17"/>
               </w:rPr>
-              <w:t xml:space="preserve">Dual-Stream </w:t>
-            </w:r>
-            <w:r>
-              <w:rPr>
-                <w:rFonts w:ascii="Times New Roman" w:hAnsi="Times New Roman"/>
-                <w:b/>
-                <w:color w:val="000000"/>
-                <w:sz w:val="17"/>
-              </w:rPr>
-              <w:t>YOLOv8n + MobileNetV2-BiGRU + PIP Zone</w:t>
+              <w:t>Dual-Stream YOLOv8n + MobileNetV2-BiGRU + PIP Zone</w:t>
             </w:r>
           </w:p>
         </w:tc>
@@ -1055,31 +873,7 @@
           <w:color w:val="000000"/>
           <w:sz w:val="20"/>
         </w:rPr>
-        <w:t>To build a resi</w:t>
-      </w:r>
-      <w:r>
-        <w:rPr>
-          <w:rFonts w:ascii="Times New Roman" w:hAnsi="Times New Roman"/>
-          <w:color w:val="000000"/>
-          <w:sz w:val="20"/>
-        </w:rPr>
-        <w:t>lient multi-threat model capable of general surveillance generalization without domain bias, a composite dataset spanning five public benchmark sources was established: (1) fcakyon/gun-object-detection for tactical weaponry; (2) betasecond/jimei-fire-smoke</w:t>
-      </w:r>
-      <w:r>
-        <w:rPr>
-          <w:rFonts w:ascii="Times New Roman" w:hAnsi="Times New Roman"/>
-          <w:color w:val="000000"/>
-          <w:sz w:val="20"/>
-        </w:rPr>
-        <w:t>-yolo-dataset for flames and smoke plumes; (3) DeZan/fall-detection for human medical and slip falls; (4) UCF-Crime subset for burglary, shoplifting, and theft; and (5) GodsEye violence dataset for fights and assault. The raw corpus was curated, yielding 5</w:t>
-      </w:r>
-      <w:r>
-        <w:rPr>
-          <w:rFonts w:ascii="Times New Roman" w:hAnsi="Times New Roman"/>
-          <w:color w:val="000000"/>
-          <w:sz w:val="20"/>
-        </w:rPr>
-        <w:t>,751 unified image-label pairs (4,635 training, 1,116 validation) and 180 video streams (144 training, 36 validation).</w:t>
+        <w:t>To build a resilient multi-threat model capable of general surveillance generalization without domain bias, a composite dataset spanning five public benchmark sources was established: (1) fcakyon/gun-object-detection for tactical weaponry; (2) betasecond/jimei-fire-smoke-yolo-dataset for flames and smoke plumes; (3) DeZan/fall-detection for human medical and slip falls; (4) UCF-Crime subset for burglary, shoplifting, and theft; and (5) GodsEye violence dataset for fights and assault. The raw corpus was curated, yielding 5,751 unified image-label pairs (4,635 training, 1,116 validation) and 180 video streams (144 training, 36 validation).</w:t>
       </w:r>
     </w:p>
     <w:p>
@@ -1107,15 +901,7 @@
           <w:color w:val="000000"/>
           <w:sz w:val="20"/>
         </w:rPr>
-        <w:t xml:space="preserve">The spatial detector minimizes a composite loss function comprising Complete Intersection </w:t>
-      </w:r>
-      <w:r>
-        <w:rPr>
-          <w:rFonts w:ascii="Times New Roman" w:hAnsi="Times New Roman"/>
-          <w:color w:val="000000"/>
-          <w:sz w:val="20"/>
-        </w:rPr>
-        <w:t>over Union (CIoU), Distribution Focal Loss (DFL), and Binary Cross-Entropy classification loss (BCE):</w:t>
+        <w:t>The spatial detector minimizes a composite loss function comprising Complete Intersection over Union (CIoU), Distribution Focal Loss (DFL), and Binary Cross-Entropy classification loss (BCE):</w:t>
       </w:r>
       <w:r>
         <w:rPr>
@@ -1133,15 +919,7 @@
           <w:sz w:val="20"/>
         </w:rPr>
         <w:br/>
-        <w:t>The temporal action classifier minimizes categorical cross-entropy</w:t>
-      </w:r>
-      <w:r>
-        <w:rPr>
-          <w:rFonts w:ascii="Times New Roman" w:hAnsi="Times New Roman"/>
-          <w:color w:val="000000"/>
-          <w:sz w:val="20"/>
-        </w:rPr>
-        <w:t xml:space="preserve"> loss over the predicted action probability distribution across K = 3 classes:</w:t>
+        <w:t>The temporal action classifier minimizes categorical cross-entropy loss over the predicted action probability distribution across K = 3 classes:</w:t>
       </w:r>
       <w:r>
         <w:rPr>
@@ -1176,32 +954,7 @@
           <w:color w:val="000000"/>
           <w:sz w:val="20"/>
         </w:rPr>
-        <w:t xml:space="preserve">The proposed end-to-end framework operates across four decoupled </w:t>
-      </w:r>
-      <w:r>
-        <w:rPr>
-          <w:rFonts w:ascii="Times New Roman" w:hAnsi="Times New Roman"/>
-          <w:color w:val="000000"/>
-          <w:sz w:val="20"/>
-        </w:rPr>
-        <w:t>pipeline tiers as illustrated in Fig. 1: (1) Video Ingestion Tier handling RTSP, USB webcams, and recorded video files; (2) Spatio-Geometric Detection Tier executing YOLOv8n and Point-in-Polygon perimeter checks; (3) Temporal Action Recognition Tier utiliz</w:t>
-      </w:r>
-      <w:r>
-        <w:rPr>
-          <w:rFonts w:ascii="Times New Roman" w:hAnsi="Times New Roman"/>
-          <w:color w:val="000000"/>
-          <w:sz w:val="20"/>
-        </w:rPr>
-        <w:t xml:space="preserve">ing MobileNetV2 and Bidirectional GRU; </w:t>
-      </w:r>
-      <w:r>
-        <w:rPr>
-          <w:rFonts w:ascii="Times New Roman" w:hAnsi="Times New Roman"/>
-          <w:color w:val="000000"/>
-          <w:sz w:val="20"/>
-        </w:rPr>
-        <w:lastRenderedPageBreak/>
-        <w:t>and (4) Surveillance Operations Center providing real-time MJPEG streaming, acoustic siren alerts, and automated incident logging.</w:t>
+        <w:t>The proposed end-to-end framework operates across four decoupled pipeline tiers as illustrated in Fig. 1: (1) Video Ingestion Tier handling RTSP, USB webcams, and recorded video files; (2) Spatio-Geometric Detection Tier executing YOLOv8n and Point-in-Polygon perimeter checks; (3) Temporal Action Recognition Tier utilizing MobileNetV2 and Bidirectional GRU; and (4) Surveillance Operations Center providing real-time MJPEG streaming, acoustic siren alerts, and automated incident logging.</w:t>
       </w:r>
     </w:p>
     <w:p>
@@ -1213,6 +966,7 @@
         <w:rPr>
           <w:noProof/>
         </w:rPr>
+        <w:lastRenderedPageBreak/>
         <w:drawing>
           <wp:inline distT="0" distB="0" distL="0" distR="0">
             <wp:extent cx="5669280" cy="3070860"/>
@@ -1262,16 +1016,7 @@
           <w:color w:val="000000"/>
           <w:sz w:val="17"/>
         </w:rPr>
-        <w:t xml:space="preserve">Fig. 1. End-to-end system architecture of the Smart CCTV Surveillance Operations </w:t>
-      </w:r>
-      <w:r>
-        <w:rPr>
-          <w:rFonts w:ascii="Times New Roman" w:hAnsi="Times New Roman"/>
-          <w:b/>
-          <w:color w:val="000000"/>
-          <w:sz w:val="17"/>
-        </w:rPr>
-        <w:t>Center across ingestion, spatial analysis, temporal action recognition, and web operations tiers.</w:t>
+        <w:t>Fig. 1. End-to-end system architecture of the Smart CCTV Surveillance Operations Center across ingestion, spatial analysis, temporal action recognition, and web operations tiers.</w:t>
       </w:r>
     </w:p>
     <w:p>
@@ -1299,23 +1044,7 @@
           <w:color w:val="000000"/>
           <w:sz w:val="20"/>
         </w:rPr>
-        <w:t>Each incoming video frame is duplicated into an unannotated reference frame (raw_frame) and an active display canvas. T</w:t>
-      </w:r>
-      <w:r>
-        <w:rPr>
-          <w:rFonts w:ascii="Times New Roman" w:hAnsi="Times New Roman"/>
-          <w:color w:val="000000"/>
-          <w:sz w:val="20"/>
-        </w:rPr>
-        <w:t>he reference frame passes through the fine-tuned YOLOv8n detector to localize tactical weapons, flames, smoke, and slips/falls. Simultaneously, a dedicated person localization head extracts pedestrian foot-contact ground coordinates (cx, y2) evaluated agai</w:t>
-      </w:r>
-      <w:r>
-        <w:rPr>
-          <w:rFonts w:ascii="Times New Roman" w:hAnsi="Times New Roman"/>
-          <w:color w:val="000000"/>
-          <w:sz w:val="20"/>
-        </w:rPr>
-        <w:t>nst user-configured polygon perimeter coordinates via Point-in-Polygon (PIP) raycasting.</w:t>
+        <w:t>Each incoming video frame is duplicated into an unannotated reference frame (raw_frame) and an active display canvas. The reference frame passes through the fine-tuned YOLOv8n detector to localize tactical weapons, flames, smoke, and slips/falls. Simultaneously, a dedicated person localization head extracts pedestrian foot-contact ground coordinates (cx, y2) evaluated against user-configured polygon perimeter coordinates via Point-in-Polygon (PIP) raycasting.</w:t>
       </w:r>
     </w:p>
     <w:p>
@@ -1343,23 +1072,7 @@
           <w:color w:val="000000"/>
           <w:sz w:val="20"/>
         </w:rPr>
-        <w:t xml:space="preserve">A rolling deque buffer maintains the sixteen most recent unannotated video frames (T = 16). The sequence batch is passed through an </w:t>
-      </w:r>
-      <w:r>
-        <w:rPr>
-          <w:rFonts w:ascii="Times New Roman" w:hAnsi="Times New Roman"/>
-          <w:color w:val="000000"/>
-          <w:sz w:val="20"/>
-        </w:rPr>
-        <w:t>ImageNet pre-trained MobileNetV2 [3] convolutional backbone with frozen early feature layers, producing 1280-dimensional feature representations. A Bidirectional Gated Recurrent Unit (BiGRU) processes forward and reverse temporal dynamics, consolidated via</w:t>
-      </w:r>
-      <w:r>
-        <w:rPr>
-          <w:rFonts w:ascii="Times New Roman" w:hAnsi="Times New Roman"/>
-          <w:color w:val="000000"/>
-          <w:sz w:val="20"/>
-        </w:rPr>
-        <w:t xml:space="preserve"> temporal average pooling across the temporal dimension.</w:t>
+        <w:t>A rolling deque buffer maintains the sixteen most recent unannotated video frames (T = 16). The sequence batch is passed through an ImageNet pre-trained MobileNetV2 [3] convolutional backbone with frozen early feature layers, producing 1280-dimensional feature representations. A Bidirectional Gated Recurrent Unit (BiGRU) processes forward and reverse temporal dynamics, consolidated via temporal average pooling across the temporal dimension.</w:t>
       </w:r>
     </w:p>
     <w:p>
@@ -1387,23 +1100,7 @@
           <w:color w:val="000000"/>
           <w:sz w:val="20"/>
         </w:rPr>
-        <w:t>To prevent false alarms caused by transient single-frame model fluctuations, every threat channel undergoes temporal debouncing. A threat counter increm</w:t>
-      </w:r>
-      <w:r>
-        <w:rPr>
-          <w:rFonts w:ascii="Times New Roman" w:hAnsi="Times New Roman"/>
-          <w:color w:val="000000"/>
-          <w:sz w:val="20"/>
-        </w:rPr>
-        <w:t>ents when a candidate threat is detected and decrements otherwise, capped by an upper ceiling C_max = 10. An alarm is confirmed only when the counter reaches or exceeds 2 frames. In LIVE mode, confirmed alarms trigger audio-visual siren wails and interacti</w:t>
-      </w:r>
-      <w:r>
-        <w:rPr>
-          <w:rFonts w:ascii="Times New Roman" w:hAnsi="Times New Roman"/>
-          <w:color w:val="000000"/>
-          <w:sz w:val="20"/>
-        </w:rPr>
-        <w:t>ve modals, while RECORDED feeds silently record forensic incident logs with exact video timecodes (mm:ss).</w:t>
+        <w:t>To prevent false alarms caused by transient single-frame model fluctuations, every threat channel undergoes temporal debouncing. A threat counter increments when a candidate threat is detected and decrements otherwise, capped by an upper ceiling C_max = 10. An alarm is confirmed only when the counter reaches or exceeds 2 frames. In LIVE mode, confirmed alarms trigger audio-visual siren wails and interactive modals, while RECORDED feeds silently record forensic incident logs with exact video timecodes (mm:ss).</w:t>
       </w:r>
     </w:p>
     <w:p>
@@ -1444,23 +1141,7 @@
           <w:color w:val="000000"/>
           <w:sz w:val="20"/>
         </w:rPr>
-        <w:t>The fine-tuned spatial model was trained using transfer learning starting from pre-t</w:t>
-      </w:r>
-      <w:r>
-        <w:rPr>
-          <w:rFonts w:ascii="Times New Roman" w:hAnsi="Times New Roman"/>
-          <w:color w:val="000000"/>
-          <w:sz w:val="20"/>
-        </w:rPr>
-        <w:t>rained COCO weights on an Intel Core i5-13420H CPU architecture without dedicated GPU acceleration. Convergence was achieved within 15 epochs, yielding 77.9% overall precision, 90.9% precision on smoke plumes, and 77.2% mAP@50 on human slip-and-fall incide</w:t>
-      </w:r>
-      <w:r>
-        <w:rPr>
-          <w:rFonts w:ascii="Times New Roman" w:hAnsi="Times New Roman"/>
-          <w:color w:val="000000"/>
-          <w:sz w:val="20"/>
-        </w:rPr>
-        <w:t>nts. The temporal action classifier achieved 78.5% training accuracy and 58.3% validation accuracy.</w:t>
+        <w:t>The fine-tuned spatial model was trained using transfer learning starting from pre-trained COCO weights on an Intel Core i5-13420H CPU architecture without dedicated GPU acceleration. Convergence was achieved within 15 epochs, yielding 77.9% overall precision, 90.9% precision on smoke plumes, and 77.2% mAP@50 on human slip-and-fall incidents. The temporal action classifier achieved 78.5% training accuracy and 58.3% validation accuracy.</w:t>
       </w:r>
     </w:p>
     <w:p>
@@ -1522,16 +1203,7 @@
           <w:color w:val="000000"/>
           <w:sz w:val="17"/>
         </w:rPr>
-        <w:t>Fig. 2. Quantitative evaluation metrics: (a) Per-class Precision and mAP@50 values for spatial threat localization; (b) Video action classifier accuracy a</w:t>
-      </w:r>
-      <w:r>
-        <w:rPr>
-          <w:rFonts w:ascii="Times New Roman" w:hAnsi="Times New Roman"/>
-          <w:b/>
-          <w:color w:val="000000"/>
-          <w:sz w:val="17"/>
-        </w:rPr>
-        <w:t>nd real-time inference latency (FPS) on CPU.</w:t>
+        <w:t>Fig. 2. Quantitative evaluation metrics: (a) Per-class Precision and mAP@50 values for spatial threat localization; (b) Video action classifier accuracy and real-time inference latency (FPS) on CPU.</w:t>
       </w:r>
     </w:p>
     <w:p>
@@ -1803,15 +1475,7 @@
                 <w:color w:val="000000"/>
                 <w:sz w:val="17"/>
               </w:rPr>
-              <w:t>3 (Fire</w:t>
-            </w:r>
-            <w:r>
-              <w:rPr>
-                <w:rFonts w:ascii="Times New Roman" w:hAnsi="Times New Roman"/>
-                <w:color w:val="000000"/>
-                <w:sz w:val="17"/>
-              </w:rPr>
-              <w:t xml:space="preserve"> / Smoke)</w:t>
+              <w:t>3 (Fire / Smoke)</w:t>
             </w:r>
           </w:p>
         </w:tc>
@@ -2122,16 +1786,7 @@
                 <w:color w:val="000000"/>
                 <w:sz w:val="18"/>
               </w:rPr>
-              <w:t xml:space="preserve">Environmental </w:t>
-            </w:r>
-            <w:r>
-              <w:rPr>
-                <w:rFonts w:ascii="Times New Roman" w:hAnsi="Times New Roman"/>
-                <w:b/>
-                <w:color w:val="000000"/>
-                <w:sz w:val="18"/>
-              </w:rPr>
-              <w:t>Conditions</w:t>
+              <w:t>Environmental Conditions</w:t>
             </w:r>
           </w:p>
         </w:tc>
@@ -2278,15 +1933,7 @@
                 <w:color w:val="000000"/>
                 <w:sz w:val="17"/>
               </w:rPr>
-              <w:t xml:space="preserve">Flames detected in 3 frames; smoke </w:t>
-            </w:r>
-            <w:r>
-              <w:rPr>
-                <w:rFonts w:ascii="Times New Roman" w:hAnsi="Times New Roman"/>
-                <w:color w:val="000000"/>
-                <w:sz w:val="17"/>
-              </w:rPr>
-              <w:t>detected in 4 frames</w:t>
+              <w:t>Flames detected in 3 frames; smoke detected in 4 frames</w:t>
             </w:r>
           </w:p>
         </w:tc>
@@ -2447,15 +2094,7 @@
           <w:b/>
           <w:color w:val="000000"/>
         </w:rPr>
-        <w:t xml:space="preserve">VI. </w:t>
-      </w:r>
-      <w:r>
-        <w:rPr>
-          <w:rFonts w:ascii="Times New Roman" w:hAnsi="Times New Roman"/>
-          <w:b/>
-          <w:color w:val="000000"/>
-        </w:rPr>
-        <w:t>CONCLUSION AND FUTURE WORK</w:t>
+        <w:t>VI. CONCLUSION AND FUTURE WORK</w:t>
       </w:r>
     </w:p>
     <w:p>
@@ -2468,31 +2107,7 @@
           <w:color w:val="000000"/>
           <w:sz w:val="20"/>
         </w:rPr>
-        <w:t>This paper presented an autonomous Smart CCTV Surveillance Operations Center that integrates spatial object detection, temporal action recognition, and virtual perimeter monitoring into a unified framework. By applying transfer l</w:t>
-      </w:r>
-      <w:r>
-        <w:rPr>
-          <w:rFonts w:ascii="Times New Roman" w:hAnsi="Times New Roman"/>
-          <w:color w:val="000000"/>
-          <w:sz w:val="20"/>
-        </w:rPr>
-        <w:t>earning to lightweight pre-trained YOLOv8n and MobileNetV2-BiGRU networks, the system achieves 77.9% overall spatial precision and 78.5% action recognition accuracy while maintaining real-time throughput on standard CPU architectures. The integration of Po</w:t>
-      </w:r>
-      <w:r>
-        <w:rPr>
-          <w:rFonts w:ascii="Times New Roman" w:hAnsi="Times New Roman"/>
-          <w:color w:val="000000"/>
-          <w:sz w:val="20"/>
-        </w:rPr>
-        <w:t>int-in-Polygon intrusion monitoring, temporal debouncing, and automated live-versus-recorded alert handling provides a practical, production-ready solution that bridges the gap between academic computer vision models and real-world security operations cent</w:t>
-      </w:r>
-      <w:r>
-        <w:rPr>
-          <w:rFonts w:ascii="Times New Roman" w:hAnsi="Times New Roman"/>
-          <w:color w:val="000000"/>
-          <w:sz w:val="20"/>
-        </w:rPr>
-        <w:t>ers.</w:t>
+        <w:t>This paper presented an autonomous Smart CCTV Surveillance Operations Center that integrates spatial object detection, temporal action recognition, and virtual perimeter monitoring into a unified framework. By applying transfer learning to lightweight pre-trained YOLOv8n and MobileNetV2-BiGRU networks, the system achieves 77.9% overall spatial precision and 78.5% action recognition accuracy while maintaining real-time throughput on standard CPU architectures. The integration of Point-in-Polygon intrusion monitoring, temporal debouncing, and automated live-versus-recorded alert handling provides a practical, production-ready solution that bridges the gap between academic computer vision models and real-world security operations centers.</w:t>
       </w:r>
     </w:p>
     <w:p>
@@ -2505,15 +2120,7 @@
           <w:color w:val="000000"/>
           <w:sz w:val="20"/>
         </w:rPr>
-        <w:t xml:space="preserve">Future work will focus on integrating TensorRT and OpenVINO quantization to achieve sub-15ms inference latencies on ultra-low-power micro-edge hardware (such as the Raspberry Pi 5 and NVIDIA Jetson Orin Nano). In addition, integrating multi-camera </w:t>
-      </w:r>
-      <w:r>
-        <w:rPr>
-          <w:rFonts w:ascii="Times New Roman" w:hAnsi="Times New Roman"/>
-          <w:color w:val="000000"/>
-          <w:sz w:val="20"/>
-        </w:rPr>
-        <w:t>pedestrian re-identification (Re-ID) will enable automated trajectory tracking across disjoint camera networks in large-scale smart city deployments.</w:t>
+        <w:t>Future work will focus on integrating TensorRT and OpenVINO quantization to achieve sub-15ms inference latencies on ultra-low-power micro-edge hardware (such as the Raspberry Pi 5 and NVIDIA Jetson Orin Nano). In addition, integrating multi-camera pedestrian re-identification (Re-ID) will enable automated trajectory tracking across disjoint camera networks in large-scale smart city deployments.</w:t>
       </w:r>
     </w:p>
     <w:p>
@@ -2547,7 +2154,14 @@
           <w:rFonts w:ascii="Times New Roman" w:hAnsi="Times New Roman"/>
           <w:sz w:val="17"/>
         </w:rPr>
-        <w:t>J. Redmon, S. Divvala, R. Girshick, and A. Farhadi, 'You only look once: Unified, real-time object detection,' in Proc. IEEE Conf. Comput. Vis. Pattern Recognit. (CVPR), 2016, pp. 779–788.</w:t>
+        <w:t>J. Redmon, S. Divvala, R. Girshick, and A. Farhadi, 'You only look once: Unified, real-time object detection,' in Proc. IEEE Conf. Comput. Vis. Pattern Recognit. (CVPR), 2016, pp.</w:t>
+      </w:r>
+      <w:r>
+        <w:rPr>
+          <w:rFonts w:ascii="Times New Roman" w:hAnsi="Times New Roman"/>
+          <w:sz w:val="17"/>
+        </w:rPr>
+        <w:t xml:space="preserve"> 779–788.</w:t>
       </w:r>
     </w:p>
     <w:p>
@@ -2561,6 +2175,7 @@
           <w:b/>
           <w:sz w:val="18"/>
         </w:rPr>
+        <w:lastRenderedPageBreak/>
         <w:t xml:space="preserve">[2] </w:t>
       </w:r>
       <w:r>
@@ -2589,7 +2204,14 @@
           <w:rFonts w:ascii="Times New Roman" w:hAnsi="Times New Roman"/>
           <w:sz w:val="17"/>
         </w:rPr>
-        <w:t>M. Sandler, A. Howard, M. Zhu, A. Zhmoginov, and L. C. Chen, 'MobileNetV2: Inverted residuals and linear bottlenecks,' in Proc. IEEE Conf. Comput. Vis. Pattern Recognit. (CVPR), 2018, pp. 4510–4520.</w:t>
+        <w:t>M. Sandler, A. Howard, M. Zhu, A.</w:t>
+      </w:r>
+      <w:r>
+        <w:rPr>
+          <w:rFonts w:ascii="Times New Roman" w:hAnsi="Times New Roman"/>
+          <w:sz w:val="17"/>
+        </w:rPr>
+        <w:t xml:space="preserve"> Zhmoginov, and L. C. Chen, 'MobileNetV2: Inverted residuals and linear bottlenecks,' in Proc. IEEE Conf. Comput. Vis. Pattern Recognit. (CVPR), 2018, pp. 4510–4520.</w:t>
       </w:r>
     </w:p>
     <w:p>
@@ -2610,7 +2232,14 @@
           <w:rFonts w:ascii="Times New Roman" w:hAnsi="Times New Roman"/>
           <w:sz w:val="17"/>
         </w:rPr>
-        <w:t>J. Donahue, L. Anne Hendricks, S. Guadarrama, M. Rohrbach, S. Venugopalan, T. Darrell, and K. Saenko, 'Long-term recurrent convolutional networks for visual recognition and description,' in Proc. IEEE Conf. Comput. Vis. Pattern Recognit. (CVPR), 2015, pp. 2625–2634.</w:t>
+        <w:t>J. Donahue, L. Anne Hendricks, S. Guadarrama, M. Rohrbach, S. Venugopalan, T. Darrell,</w:t>
+      </w:r>
+      <w:r>
+        <w:rPr>
+          <w:rFonts w:ascii="Times New Roman" w:hAnsi="Times New Roman"/>
+          <w:sz w:val="17"/>
+        </w:rPr>
+        <w:t xml:space="preserve"> and K. Saenko, 'Long-term recurrent convolutional networks for visual recognition and description,' in Proc. IEEE Conf. Comput. Vis. Pattern Recognit. (CVPR), 2015, pp. 2625–2634.</w:t>
       </w:r>
     </w:p>
     <w:p>
@@ -2631,7 +2260,14 @@
           <w:rFonts w:ascii="Times New Roman" w:hAnsi="Times New Roman"/>
           <w:sz w:val="17"/>
         </w:rPr>
-        <w:t>W. Sultani, C. Chen, and M. Shah, 'Real-world anomaly detection in surveillance videos,' in Proc. IEEE Conf. Comput. Vis. Pattern Recognit. (CVPR), 2018, pp. 6479–6488.</w:t>
+        <w:t>W. Sultani, C. Chen, and M. Shah, 'Real-world anomaly detection in surv</w:t>
+      </w:r>
+      <w:r>
+        <w:rPr>
+          <w:rFonts w:ascii="Times New Roman" w:hAnsi="Times New Roman"/>
+          <w:sz w:val="17"/>
+        </w:rPr>
+        <w:t>eillance videos,' in Proc. IEEE Conf. Comput. Vis. Pattern Recognit. (CVPR), 2018, pp. 6479–6488.</w:t>
       </w:r>
     </w:p>
     <w:p>
@@ -2652,7 +2288,14 @@
           <w:rFonts w:ascii="Times New Roman" w:hAnsi="Times New Roman"/>
           <w:sz w:val="17"/>
         </w:rPr>
-        <w:t>G. Eason, B. Noble, and I. N. Sneddon, 'On certain integrals of Lipschitz-Hankel type involving products of Bessel functions,' Phil. Trans. Roy. Soc. London, vol. A247, pp. 529–551, Apr. 1955.</w:t>
+        <w:t>G. Eason, B. Noble, and I. N. Sneddon, 'On certain integrals of Lipschitz-Hankel type involving products of Bessel functions,' Phil. Trans. Roy. Soc. Lond</w:t>
+      </w:r>
+      <w:r>
+        <w:rPr>
+          <w:rFonts w:ascii="Times New Roman" w:hAnsi="Times New Roman"/>
+          <w:sz w:val="17"/>
+        </w:rPr>
+        <w:t>on, vol. A247, pp. 529–551, Apr. 1955.</w:t>
       </w:r>
     </w:p>
     <w:p>
@@ -2694,7 +2337,14 @@
           <w:rFonts w:ascii="Times New Roman" w:hAnsi="Times New Roman"/>
           <w:sz w:val="17"/>
         </w:rPr>
-        <w:t>J. Carreira and A. Zisserman, 'Quo vadis, action recognition? A new model and the kinetics dataset,' in Proc. IEEE Conf. Comput. Vis. Pattern Recognit. (CVPR), 2017, pp. 6299–6308.</w:t>
+        <w:t>J. Carreira and A. Zisserman, 'Quo vadis, acti</w:t>
+      </w:r>
+      <w:r>
+        <w:rPr>
+          <w:rFonts w:ascii="Times New Roman" w:hAnsi="Times New Roman"/>
+          <w:sz w:val="17"/>
+        </w:rPr>
+        <w:t>on recognition? A new model and the kinetics dataset,' in Proc. IEEE Conf. Comput. Vis. Pattern Recognit. (CVPR), 2017, pp. 6299–6308.</w:t>
       </w:r>
     </w:p>
     <w:p>
@@ -2715,7 +2365,14 @@
           <w:rFonts w:ascii="Times New Roman" w:hAnsi="Times New Roman"/>
           <w:sz w:val="17"/>
         </w:rPr>
-        <w:t>Z. Zheng, P. Wang, W. Liu, J. Li, R. Ye, and D. Ren, 'Distance-IoU loss: Faster and better learning for bounding box regression,' in Proc. AAAI Conf. Artif. Intell., vol. 34, no. 7, 2020, pp. 12993–13000.</w:t>
+        <w:t xml:space="preserve">Z. Zheng, P. Wang, W. Liu, J. Li, R. Ye, and D. Ren, 'Distance-IoU loss: Faster and better learning for bounding box </w:t>
+      </w:r>
+      <w:r>
+        <w:rPr>
+          <w:rFonts w:ascii="Times New Roman" w:hAnsi="Times New Roman"/>
+          <w:sz w:val="17"/>
+        </w:rPr>
+        <w:t>regression,' in Proc. AAAI Conf. Artif. Intell., vol. 34, no. 7, 2020, pp. 12993–13000.</w:t>
       </w:r>
     </w:p>
     <w:p>
@@ -2736,7 +2393,14 @@
           <w:rFonts w:ascii="Times New Roman" w:hAnsi="Times New Roman"/>
           <w:sz w:val="17"/>
         </w:rPr>
-        <w:t>K. Cho, B. van Merrienboer, D. Bahdanau, and Y. Bengio, 'On the properties of neural machine translation: Encoder-decoder approaches,' in Proc. Workshop Syntax Semant. Struct. Stat. Transl., 2014, pp. 103–111.</w:t>
+        <w:t>K. Cho, B. van Merrienboer, D. Bahdanau, and Y. Bengio, 'On the properties of neural machine translation: Encoder-decoder approaches,' in Proc. Workshop Syntax Sem</w:t>
+      </w:r>
+      <w:r>
+        <w:rPr>
+          <w:rFonts w:ascii="Times New Roman" w:hAnsi="Times New Roman"/>
+          <w:sz w:val="17"/>
+        </w:rPr>
+        <w:t>ant. Struct. Stat. Transl., 2014, pp. 103–111.</w:t>
       </w:r>
     </w:p>
     <w:p>
@@ -2778,7 +2442,14 @@
           <w:rFonts w:ascii="Times New Roman" w:hAnsi="Times New Roman"/>
           <w:sz w:val="17"/>
         </w:rPr>
-        <w:t>A. Ullah, J. Ahmad, K. Muhammad, M. Sajjad, and S. W. Baik, 'Directed acyclic graph-based deep CNN for visual violence detection in surveillance videos,' IEEE Trans. Ind. Inform., vol. 15, no. 5, pp. 2891–2900, May 2019.</w:t>
+        <w:t xml:space="preserve">A. Ullah, J. Ahmad, K. Muhammad, M. </w:t>
+      </w:r>
+      <w:r>
+        <w:rPr>
+          <w:rFonts w:ascii="Times New Roman" w:hAnsi="Times New Roman"/>
+          <w:sz w:val="17"/>
+        </w:rPr>
+        <w:t>Sajjad, and S. W. Baik, 'Directed acyclic graph-based deep CNN for visual violence detection in surveillance videos,' IEEE Trans. Ind. Inform., vol. 15, no. 5, pp. 2891–2900, May 2019.</w:t>
       </w:r>
     </w:p>
     <w:p>
@@ -2799,7 +2470,14 @@
           <w:rFonts w:ascii="Times New Roman" w:hAnsi="Times New Roman"/>
           <w:sz w:val="17"/>
         </w:rPr>
-        <w:t>A. Sharma, P. K. Singh, and R. Sarkar, 'Deep learning-based fire detection systems: A systematic review,' IEEE Access, vol. 8, pp. 182743–182766, Oct. 2020.</w:t>
+        <w:t>A. Sharma, P. K. Singh, and R. Sarkar, 'Deep learning-based fire d</w:t>
+      </w:r>
+      <w:r>
+        <w:rPr>
+          <w:rFonts w:ascii="Times New Roman" w:hAnsi="Times New Roman"/>
+          <w:sz w:val="17"/>
+        </w:rPr>
+        <w:t>etection systems: A systematic review,' IEEE Access, vol. 8, pp. 182743–182766, Oct. 2020.</w:t>
       </w:r>
     </w:p>
     <w:p>
@@ -2820,7 +2498,14 @@
           <w:rFonts w:ascii="Times New Roman" w:hAnsi="Times New Roman"/>
           <w:sz w:val="17"/>
         </w:rPr>
-        <w:t>Z. Jiao, Y. Zhao, and G. Chen, 'A deep learning approach to fall detection with vision and depth sensors,' IEEE Trans. Cognitive Dev. Syst., vol. 12, no. 2, pp. 210–221, Jun. 2020.</w:t>
+        <w:t>Z. Jiao, Y. Zhao, and G. Chen, 'A deep learning approach to fall detection with vision and depth sensors,' IEEE Trans. Cognitive Dev. Syst., vol. 12, no. 2, pp.</w:t>
+      </w:r>
+      <w:r>
+        <w:rPr>
+          <w:rFonts w:ascii="Times New Roman" w:hAnsi="Times New Roman"/>
+          <w:sz w:val="17"/>
+        </w:rPr>
+        <w:t xml:space="preserve"> 210–221, Jun. 2020.</w:t>
       </w:r>
     </w:p>
     <w:p>
@@ -2862,7 +2547,14 @@
           <w:rFonts w:ascii="Times New Roman" w:hAnsi="Times New Roman"/>
           <w:sz w:val="17"/>
         </w:rPr>
-        <w:t>T. Y. Lin, P. Goyal, R. Girshick, K. He, and P. Dollar, 'Focal loss for dense object detection,' in Proc. IEEE Int. Conf. Comput. Vis. (ICCV), 2017, pp. 2980–2988.</w:t>
+        <w:t>T. Y. Lin, P. Goyal, R. Girshi</w:t>
+      </w:r>
+      <w:r>
+        <w:rPr>
+          <w:rFonts w:ascii="Times New Roman" w:hAnsi="Times New Roman"/>
+          <w:sz w:val="17"/>
+        </w:rPr>
+        <w:t>ck, K. He, and P. Dollar, 'Focal loss for dense object detection,' in Proc. IEEE Int. Conf. Comput. Vis. (ICCV), 2017, pp. 2980–2988.</w:t>
       </w:r>
     </w:p>
     <w:p>
@@ -2883,7 +2575,14 @@
           <w:rFonts w:ascii="Times New Roman" w:hAnsi="Times New Roman"/>
           <w:sz w:val="17"/>
         </w:rPr>
-        <w:t>D. P. Kingma and J. Ba, 'Adam: A method for stochastic optimization,' in Proc. Int. Conf. Learn. Represent. (ICLR), 2015, pp. 1–15.</w:t>
+        <w:t>D. P. Kingma and J. Ba, 'Adam: A method for stochastic optimization,' in Proc. Int. Conf. Learn. Represent. (ICLR), 2</w:t>
+      </w:r>
+      <w:r>
+        <w:rPr>
+          <w:rFonts w:ascii="Times New Roman" w:hAnsi="Times New Roman"/>
+          <w:sz w:val="17"/>
+        </w:rPr>
+        <w:t>015, pp. 1–15.</w:t>
       </w:r>
     </w:p>
     <w:p>
@@ -2925,7 +2624,14 @@
           <w:rFonts w:ascii="Times New Roman" w:hAnsi="Times New Roman"/>
           <w:sz w:val="17"/>
         </w:rPr>
-        <w:t>M. Young, The Technical Writer's Handbook. Mill Valley, CA: University Science, 1989.</w:t>
+        <w:t>M. Young, The Technical Writer's Handbook. Mill Valley</w:t>
+      </w:r>
+      <w:r>
+        <w:rPr>
+          <w:rFonts w:ascii="Times New Roman" w:hAnsi="Times New Roman"/>
+          <w:sz w:val="17"/>
+        </w:rPr>
+        <w:t>, CA: University Science, 1989.</w:t>
       </w:r>
     </w:p>
     <w:p>
@@ -2967,7 +2673,14 @@
           <w:rFonts w:ascii="Times New Roman" w:hAnsi="Times New Roman"/>
           <w:sz w:val="17"/>
         </w:rPr>
-        <w:t>C. Cortes and V. Vapnik, 'Support-vector networks,' Mach. Learn., vol. 20, no. 3, pp. 273–297, Sep. 1995.</w:t>
+        <w:t>C. Cortes and V. Vapnik, 'Support-vector networks,' Mach. Learn., vol. 20,</w:t>
+      </w:r>
+      <w:r>
+        <w:rPr>
+          <w:rFonts w:ascii="Times New Roman" w:hAnsi="Times New Roman"/>
+          <w:sz w:val="17"/>
+        </w:rPr>
+        <w:t xml:space="preserve"> no. 3, pp. 273–297, Sep. 1995.</w:t>
       </w:r>
     </w:p>
     <w:p>
@@ -3009,7 +2722,14 @@
           <w:rFonts w:ascii="Times New Roman" w:hAnsi="Times New Roman"/>
           <w:sz w:val="17"/>
         </w:rPr>
-        <w:t>G. J. J. van den Burg and C. K. I. Williams, 'An evaluation of change point detection algorithms,' arXiv preprint arXiv:2003.06222, 2020.</w:t>
+        <w:t>G. J. J. van den Burg and C. K. I. Williams, 'An evaluation of change point detection algorithms,' arXiv prepr</w:t>
+      </w:r>
+      <w:r>
+        <w:rPr>
+          <w:rFonts w:ascii="Times New Roman" w:hAnsi="Times New Roman"/>
+          <w:sz w:val="17"/>
+        </w:rPr>
+        <w:t>int arXiv:2003.06222, 2020.</w:t>
       </w:r>
     </w:p>
     <w:p>
@@ -3051,7 +2771,14 @@
           <w:rFonts w:ascii="Times New Roman" w:hAnsi="Times New Roman"/>
           <w:sz w:val="17"/>
         </w:rPr>
-        <w:t>G. Bradski, 'The OpenCV Library,' Dr. Dobb's Journal of Software Tools, 2000.</w:t>
+        <w:t>G. Bradski, 'The OpenCV Library,' Dr. Dobb's Journal</w:t>
+      </w:r>
+      <w:r>
+        <w:rPr>
+          <w:rFonts w:ascii="Times New Roman" w:hAnsi="Times New Roman"/>
+          <w:sz w:val="17"/>
+        </w:rPr>
+        <w:t xml:space="preserve"> of Software Tools, 2000.</w:t>
       </w:r>
     </w:p>
     <w:sectPr>
@@ -3552,10 +3279,6 @@
     <w:lsdException w:name="Book Title" w:uiPriority="33" w:qFormat="1"/>
     <w:lsdException w:name="Bibliography" w:semiHidden="1" w:uiPriority="37" w:unhideWhenUsed="1"/>
     <w:lsdException w:name="TOC Heading" w:semiHidden="1" w:uiPriority="39" w:unhideWhenUsed="1" w:qFormat="1"/>
-    <w:lsdException w:name="Grid Table Light" w:semiHidden="1" w:unhideWhenUsed="1"/>
-    <w:lsdException w:name="Grid Table 1 Light" w:semiHidden="1" w:unhideWhenUsed="1"/>
-    <w:lsdException w:name="Grid Table 2" w:semiHidden="1" w:unhideWhenUsed="1"/>
-    <w:lsdException w:name="Grid Table 3" w:semiHidden="1" w:unhideWhenUsed="1"/>
     <w:lsdException w:name="Grid Table 4" w:uiPriority="49"/>
     <w:lsdException w:name="Grid Table 5 Dark" w:uiPriority="50"/>
     <w:lsdException w:name="Grid Table 6 Colorful" w:uiPriority="51"/>
@@ -14978,7 +14701,7 @@
 </file>
 
 <file path=customXml/itemProps1.xml><?xml version="1.0" encoding="utf-8"?>
-<ds:datastoreItem xmlns:ds="http://schemas.openxmlformats.org/officeDocument/2006/customXml" ds:itemID="{6822A52E-4EBB-466C-85DB-3403951B50D0}">
+<ds:datastoreItem xmlns:ds="http://schemas.openxmlformats.org/officeDocument/2006/customXml" ds:itemID="{8E13E395-AFBC-476D-ACE4-9F53426EB3D4}">
   <ds:schemaRefs>
     <ds:schemaRef ds:uri="http://schemas.openxmlformats.org/officeDocument/2006/bibliography"/>
   </ds:schemaRefs>

</xml_diff>